<commit_message>
worksheet template: auto-inject docxtemplater placeholders + verify renderer
</commit_message>
<xml_diff>
--- a/worksheet-template-preview.docx
+++ b/worksheet-template-preview.docx
@@ -24,7 +24,7 @@
         <mc:AlternateContent>
           <mc:Choice Requires="wps">
             <w:drawing>
-              <wp:anchor distT="0" distB="0" distL="114300" distR="114300" simplePos="0" relativeHeight="251659264" behindDoc="1" locked="0" layoutInCell="1" allowOverlap="1" wp14:anchorId="4B74C21D" wp14:editId="5737DD08">
+              <wp:anchor distT="0" distB="0" distL="114300" distR="114300" simplePos="0" relativeHeight="251659264" behindDoc="1" locked="0" layoutInCell="1" allowOverlap="1" wp14:anchorId="4B74C21D" wp14:editId="4F91CD70">
                 <wp:simplePos x="0" y="0"/>
                 <wp:positionH relativeFrom="column">
                   <wp:posOffset>-352136</wp:posOffset>
@@ -109,7 +109,7 @@
         <mc:AlternateContent>
           <mc:Choice Requires="wps">
             <w:drawing>
-              <wp:anchor distT="0" distB="0" distL="114300" distR="114300" simplePos="0" relativeHeight="251658239" behindDoc="0" locked="0" layoutInCell="1" allowOverlap="1" wp14:anchorId="2EAB60F8" wp14:editId="47E186CA">
+              <wp:anchor distT="0" distB="0" distL="114300" distR="114300" simplePos="0" relativeHeight="251658239" behindDoc="0" locked="0" layoutInCell="1" allowOverlap="1" wp14:anchorId="2EAB60F8" wp14:editId="14EAC712">
                 <wp:simplePos x="0" y="0"/>
                 <wp:positionH relativeFrom="column">
                   <wp:posOffset>918633</wp:posOffset>
@@ -136,9 +136,12 @@
                             <a:gd name="adj" fmla="val 50000"/>
                           </a:avLst>
                         </a:prstGeom>
-                        <a:solidFill>
-                          <a:schemeClr val="tx1"/>
-                        </a:solidFill>
+                        <a:noFill/>
+                        <a:ln>
+                          <a:solidFill>
+                            <a:schemeClr val="tx1"/>
+                          </a:solidFill>
+                        </a:ln>
                       </wps:spPr>
                       <wps:style>
                         <a:lnRef idx="2">
@@ -163,8 +166,9 @@
                               <w:spacing w:after="80"/>
                               <w:jc w:val="center"/>
                               <w:rPr>
-                                <w:sz w:val="36"/>
-                                <w:szCs w:val="36"/>
+                                <w:color w:val="000000" w:themeColor="text1"/>
+                                <w:sz w:val="40"/>
+                                <w:szCs w:val="40"/>
                               </w:rPr>
                             </w:pPr>
                             <w:proofErr w:type="spellStart"/>
@@ -172,8 +176,9 @@
                               <w:rPr>
                                 <w:b/>
                                 <w:bCs/>
-                                <w:sz w:val="44"/>
-                                <w:szCs w:val="44"/>
+                                <w:color w:val="000000" w:themeColor="text1"/>
+                                <w:sz w:val="48"/>
+                                <w:szCs w:val="48"/>
                               </w:rPr>
                               <w:t>ใบงานที่</w:t>
                             </w:r>
@@ -182,8 +187,9 @@
                               <w:rPr>
                                 <w:b/>
                                 <w:bCs/>
-                                <w:sz w:val="44"/>
-                                <w:szCs w:val="44"/>
+                                <w:color w:val="000000" w:themeColor="text1"/>
+                                <w:sz w:val="48"/>
+                                <w:szCs w:val="48"/>
                               </w:rPr>
                               <w:t xml:space="preserve"> </w:t>
                             </w:r>
@@ -192,8 +198,9 @@
                               <w:rPr>
                                 <w:b/>
                                 <w:bCs/>
-                                <w:sz w:val="44"/>
-                                <w:szCs w:val="44"/>
+                                <w:color w:val="000000" w:themeColor="text1"/>
+                                <w:sz w:val="48"/>
+                                <w:szCs w:val="48"/>
                               </w:rPr>
                               <w:t xml:space="preserve">1  </w:t>
                             </w:r>
@@ -202,8 +209,9 @@
                               <w:rPr>
                                 <w:b/>
                                 <w:bCs/>
-                                <w:sz w:val="44"/>
-                                <w:szCs w:val="44"/>
+                                <w:color w:val="000000" w:themeColor="text1"/>
+                                <w:sz w:val="48"/>
+                                <w:szCs w:val="48"/>
                               </w:rPr>
                               <w:t>เรื่อง</w:t>
                             </w:r>
@@ -213,8 +221,9 @@
                               <w:rPr>
                                 <w:b/>
                                 <w:bCs/>
-                                <w:sz w:val="44"/>
-                                <w:szCs w:val="44"/>
+                                <w:color w:val="000000" w:themeColor="text1"/>
+                                <w:sz w:val="48"/>
+                                <w:szCs w:val="48"/>
                               </w:rPr>
                               <w:t xml:space="preserve"> Animals in the Forest</w:t>
                             </w:r>
@@ -223,8 +232,8 @@
                             <w:pPr>
                               <w:jc w:val="center"/>
                               <w:rPr>
-                                <w:sz w:val="36"/>
-                                <w:szCs w:val="36"/>
+                                <w:sz w:val="40"/>
+                                <w:szCs w:val="40"/>
                               </w:rPr>
                             </w:pPr>
                           </w:p>
@@ -250,7 +259,7 @@
           </mc:Choice>
           <mc:Fallback>
             <w:pict>
-              <v:roundrect w14:anchorId="2EAB60F8" id="Rectangle: Rounded Corners 2" o:spid="_x0000_s1026" style="position:absolute;left:0;text-align:left;margin-left:72.35pt;margin-top:-12.35pt;width:359.35pt;height:43.35pt;z-index:251658239;visibility:visible;mso-wrap-style:square;mso-width-percent:0;mso-height-percent:0;mso-wrap-distance-left:9pt;mso-wrap-distance-top:0;mso-wrap-distance-right:9pt;mso-wrap-distance-bottom:0;mso-position-horizontal:absolute;mso-position-horizontal-relative:text;mso-position-vertical:absolute;mso-position-vertical-relative:text;mso-width-percent:0;mso-height-percent:0;mso-width-relative:margin;mso-height-relative:margin;v-text-anchor:middle" arcsize=".5" o:gfxdata="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" fillcolor="black [3213]" strokecolor="#09101d [484]" strokeweight="1pt">
+              <v:roundrect w14:anchorId="2EAB60F8" id="Rectangle: Rounded Corners 2" o:spid="_x0000_s1026" style="position:absolute;left:0;text-align:left;margin-left:72.35pt;margin-top:-12.35pt;width:359.35pt;height:43.35pt;z-index:251658239;visibility:visible;mso-wrap-style:square;mso-width-percent:0;mso-height-percent:0;mso-wrap-distance-left:9pt;mso-wrap-distance-top:0;mso-wrap-distance-right:9pt;mso-wrap-distance-bottom:0;mso-position-horizontal:absolute;mso-position-horizontal-relative:text;mso-position-vertical:absolute;mso-position-vertical-relative:text;mso-width-percent:0;mso-height-percent:0;mso-width-relative:margin;mso-height-relative:margin;v-text-anchor:middle" arcsize=".5" o:gfxdata="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" filled="f" strokecolor="black [3213]" strokeweight="1pt">
                 <v:stroke joinstyle="miter"/>
                 <v:textbox>
                   <w:txbxContent>
@@ -259,8 +268,9 @@
                         <w:spacing w:after="80"/>
                         <w:jc w:val="center"/>
                         <w:rPr>
-                          <w:sz w:val="36"/>
-                          <w:szCs w:val="36"/>
+                          <w:color w:val="000000" w:themeColor="text1"/>
+                          <w:sz w:val="40"/>
+                          <w:szCs w:val="40"/>
                         </w:rPr>
                       </w:pPr>
                       <w:proofErr w:type="spellStart"/>
@@ -268,8 +278,9 @@
                         <w:rPr>
                           <w:b/>
                           <w:bCs/>
-                          <w:sz w:val="44"/>
-                          <w:szCs w:val="44"/>
+                          <w:color w:val="000000" w:themeColor="text1"/>
+                          <w:sz w:val="48"/>
+                          <w:szCs w:val="48"/>
                         </w:rPr>
                         <w:t>ใบงานที่</w:t>
                       </w:r>
@@ -278,8 +289,9 @@
                         <w:rPr>
                           <w:b/>
                           <w:bCs/>
-                          <w:sz w:val="44"/>
-                          <w:szCs w:val="44"/>
+                          <w:color w:val="000000" w:themeColor="text1"/>
+                          <w:sz w:val="48"/>
+                          <w:szCs w:val="48"/>
                         </w:rPr>
                         <w:t xml:space="preserve"> </w:t>
                       </w:r>
@@ -288,8 +300,9 @@
                         <w:rPr>
                           <w:b/>
                           <w:bCs/>
-                          <w:sz w:val="44"/>
-                          <w:szCs w:val="44"/>
+                          <w:color w:val="000000" w:themeColor="text1"/>
+                          <w:sz w:val="48"/>
+                          <w:szCs w:val="48"/>
                         </w:rPr>
                         <w:t xml:space="preserve">1  </w:t>
                       </w:r>
@@ -298,8 +311,9 @@
                         <w:rPr>
                           <w:b/>
                           <w:bCs/>
-                          <w:sz w:val="44"/>
-                          <w:szCs w:val="44"/>
+                          <w:color w:val="000000" w:themeColor="text1"/>
+                          <w:sz w:val="48"/>
+                          <w:szCs w:val="48"/>
                         </w:rPr>
                         <w:t>เรื่อง</w:t>
                       </w:r>
@@ -309,8 +323,9 @@
                         <w:rPr>
                           <w:b/>
                           <w:bCs/>
-                          <w:sz w:val="44"/>
-                          <w:szCs w:val="44"/>
+                          <w:color w:val="000000" w:themeColor="text1"/>
+                          <w:sz w:val="48"/>
+                          <w:szCs w:val="48"/>
                         </w:rPr>
                         <w:t xml:space="preserve"> Animals in the Forest</w:t>
                       </w:r>
@@ -319,8 +334,8 @@
                       <w:pPr>
                         <w:jc w:val="center"/>
                         <w:rPr>
-                          <w:sz w:val="36"/>
-                          <w:szCs w:val="36"/>
+                          <w:sz w:val="40"/>
+                          <w:szCs w:val="40"/>
                         </w:rPr>
                       </w:pPr>
                     </w:p>
@@ -403,33 +418,8 @@
           <w:b/>
           <w:bCs/>
         </w:rPr>
-        <w:t xml:space="preserve">   </w:t>
-      </w:r>
-      <w:proofErr w:type="spellStart"/>
-      <w:r>
-        <w:rPr>
-          <w:b/>
-          <w:bCs/>
-        </w:rPr>
-        <w:t>คะแนนเต็ม</w:t>
-      </w:r>
-      <w:proofErr w:type="spellEnd"/>
-      <w:r>
-        <w:rPr>
-          <w:b/>
-          <w:bCs/>
-        </w:rPr>
-        <w:t xml:space="preserve"> 10 </w:t>
-      </w:r>
-      <w:proofErr w:type="spellStart"/>
-      <w:r>
-        <w:rPr>
-          <w:b/>
-          <w:bCs/>
-        </w:rPr>
-        <w:t>คะแนน</w:t>
-      </w:r>
-      <w:proofErr w:type="spellEnd"/>
+        <w:t xml:space="preserve">   คะแนนเต็ม 10 คะแนน</w:t>
+      </w:r>
     </w:p>
     <w:tbl>
       <w:tblPr>
@@ -446,12 +436,6 @@
         <w:gridCol w:w="2912"/>
       </w:tblGrid>
       <w:tr>
-        <w:tblPrEx>
-          <w:tblCellMar>
-            <w:top w:w="0" w:type="dxa"/>
-            <w:bottom w:w="0" w:type="dxa"/>
-          </w:tblCellMar>
-        </w:tblPrEx>
         <w:tc>
           <w:tcPr>
             <w:tcW w:w="2500" w:type="pct"/>
@@ -468,28 +452,16 @@
                 <w:b/>
                 <w:bCs/>
               </w:rPr>
-              <w:t>Name:</w:t>
+              <w:t>Name: ..................................................................................</w:t>
             </w:r>
             <w:r>
               <w:rPr>
+                <w:rFonts w:hint="cs"/>
                 <w:b/>
                 <w:bCs/>
+                <w:cs/>
               </w:rPr>
-              <w:t xml:space="preserve"> ..............................</w:t>
-            </w:r>
-            <w:r>
-              <w:rPr>
-                <w:b/>
-                <w:bCs/>
-              </w:rPr>
-              <w:t>..........................</w:t>
-            </w:r>
-            <w:r>
-              <w:rPr>
-                <w:b/>
-                <w:bCs/>
-              </w:rPr>
-              <w:t>..........................</w:t>
+              <w:t>....</w:t>
             </w:r>
           </w:p>
         </w:tc>
@@ -506,17 +478,28 @@
             </w:pPr>
             <w:r>
               <w:rPr>
+                <w:rFonts w:hint="cs"/>
                 <w:b/>
                 <w:bCs/>
+                <w:cs/>
               </w:rPr>
-              <w:t>No.:</w:t>
+              <w:t xml:space="preserve">    </w:t>
             </w:r>
             <w:r>
               <w:rPr>
                 <w:b/>
                 <w:bCs/>
               </w:rPr>
-              <w:t xml:space="preserve"> .........</w:t>
+              <w:t>No.: .........</w:t>
+            </w:r>
+            <w:r>
+              <w:rPr>
+                <w:rFonts w:hint="cs"/>
+                <w:b/>
+                <w:bCs/>
+                <w:cs/>
+              </w:rPr>
+              <w:t>........</w:t>
             </w:r>
           </w:p>
         </w:tc>
@@ -536,42 +519,48 @@
                 <w:b/>
                 <w:bCs/>
               </w:rPr>
-              <w:t>Date:</w:t>
+              <w:t>Date: .....</w:t>
+            </w:r>
+            <w:r>
+              <w:rPr>
+                <w:rFonts w:hint="cs"/>
+                <w:b/>
+                <w:bCs/>
+                <w:cs/>
+              </w:rPr>
+              <w:t>.</w:t>
             </w:r>
             <w:r>
               <w:rPr>
                 <w:b/>
                 <w:bCs/>
               </w:rPr>
-              <w:t xml:space="preserve"> ....</w:t>
+              <w:t>.../....</w:t>
+            </w:r>
+            <w:r>
+              <w:rPr>
+                <w:rFonts w:hint="cs"/>
+                <w:b/>
+                <w:bCs/>
+                <w:cs/>
+              </w:rPr>
+              <w:t>..</w:t>
             </w:r>
             <w:r>
               <w:rPr>
                 <w:b/>
                 <w:bCs/>
               </w:rPr>
-              <w:t>.</w:t>
+              <w:t>.../............</w:t>
             </w:r>
             <w:r>
               <w:rPr>
+                <w:rFonts w:hint="cs"/>
                 <w:b/>
                 <w:bCs/>
+                <w:cs/>
               </w:rPr>
-              <w:t>.../......./........</w:t>
-            </w:r>
-            <w:r>
-              <w:rPr>
-                <w:b/>
-                <w:bCs/>
-              </w:rPr>
-              <w:t>...</w:t>
-            </w:r>
-            <w:r>
-              <w:rPr>
-                <w:b/>
-                <w:bCs/>
-              </w:rPr>
-              <w:t>.</w:t>
+              <w:t>..</w:t>
             </w:r>
           </w:p>
         </w:tc>
@@ -583,9 +572,6 @@
           <w:bottom w:val="single" w:sz="6" w:space="0" w:color="000000"/>
         </w:pBdr>
         <w:spacing w:after="200"/>
-        <w:rPr>
-          <w:rFonts w:hint="cs"/>
-        </w:rPr>
       </w:pPr>
     </w:p>
     <w:p>
@@ -733,12 +719,6 @@
         <w:gridCol w:w="5629"/>
       </w:tblGrid>
       <w:tr>
-        <w:tblPrEx>
-          <w:tblCellMar>
-            <w:top w:w="0" w:type="dxa"/>
-            <w:bottom w:w="0" w:type="dxa"/>
-          </w:tblCellMar>
-        </w:tblPrEx>
         <w:tc>
           <w:tcPr>
             <w:tcW w:w="400" w:type="pct"/>
@@ -809,12 +789,6 @@
         </w:tc>
       </w:tr>
       <w:tr>
-        <w:tblPrEx>
-          <w:tblCellMar>
-            <w:top w:w="0" w:type="dxa"/>
-            <w:bottom w:w="0" w:type="dxa"/>
-          </w:tblCellMar>
-        </w:tblPrEx>
         <w:tc>
           <w:tcPr>
             <w:tcW w:w="400" w:type="pct"/>
@@ -885,12 +859,6 @@
         </w:tc>
       </w:tr>
       <w:tr>
-        <w:tblPrEx>
-          <w:tblCellMar>
-            <w:top w:w="0" w:type="dxa"/>
-            <w:bottom w:w="0" w:type="dxa"/>
-          </w:tblCellMar>
-        </w:tblPrEx>
         <w:tc>
           <w:tcPr>
             <w:tcW w:w="400" w:type="pct"/>
@@ -961,12 +929,6 @@
         </w:tc>
       </w:tr>
       <w:tr>
-        <w:tblPrEx>
-          <w:tblCellMar>
-            <w:top w:w="0" w:type="dxa"/>
-            <w:bottom w:w="0" w:type="dxa"/>
-          </w:tblCellMar>
-        </w:tblPrEx>
         <w:tc>
           <w:tcPr>
             <w:tcW w:w="400" w:type="pct"/>
@@ -1037,12 +999,6 @@
         </w:tc>
       </w:tr>
       <w:tr>
-        <w:tblPrEx>
-          <w:tblCellMar>
-            <w:top w:w="0" w:type="dxa"/>
-            <w:bottom w:w="0" w:type="dxa"/>
-          </w:tblCellMar>
-        </w:tblPrEx>
         <w:tc>
           <w:tcPr>
             <w:tcW w:w="400" w:type="pct"/>
@@ -1110,6 +1066,63 @@
               <w:t>e.  a loyal pet that says “woof”</w:t>
             </w:r>
           </w:p>
+        </w:tc>
+      </w:tr>
+      <w:tr>
+        <w:tc>
+          <w:tcPr>
+            <w:tcW w:w="400" w:type="pct"/>
+            <w:tcBorders>
+              <w:top w:val="none" w:sz="0" w:space="0" w:color="FFFFFF"/>
+              <w:left w:val="none" w:sz="0" w:space="0" w:color="FFFFFF"/>
+              <w:bottom w:val="none" w:sz="0" w:space="0" w:color="FFFFFF"/>
+              <w:right w:val="none" w:sz="0" w:space="0" w:color="FFFFFF"/>
+            </w:tcBorders>
+          </w:tcPr>
+          <w:p/>
+        </w:tc>
+        <w:tc>
+          <w:tcPr>
+            <w:tcW w:w="1000" w:type="pct"/>
+            <w:tcBorders>
+              <w:top w:val="none" w:sz="0" w:space="0" w:color="FFFFFF"/>
+              <w:left w:val="none" w:sz="0" w:space="0" w:color="FFFFFF"/>
+              <w:bottom w:val="none" w:sz="0" w:space="0" w:color="FFFFFF"/>
+              <w:right w:val="none" w:sz="0" w:space="0" w:color="FFFFFF"/>
+            </w:tcBorders>
+          </w:tcPr>
+          <w:p>
+            <w:pPr>
+              <w:rPr>
+                <w:b/>
+                <w:bCs/>
+              </w:rPr>
+            </w:pPr>
+          </w:p>
+        </w:tc>
+        <w:tc>
+          <w:tcPr>
+            <w:tcW w:w="700" w:type="pct"/>
+            <w:tcBorders>
+              <w:top w:val="none" w:sz="0" w:space="0" w:color="FFFFFF"/>
+              <w:left w:val="none" w:sz="0" w:space="0" w:color="FFFFFF"/>
+              <w:bottom w:val="none" w:sz="0" w:space="0" w:color="FFFFFF"/>
+              <w:right w:val="none" w:sz="0" w:space="0" w:color="FFFFFF"/>
+            </w:tcBorders>
+          </w:tcPr>
+          <w:p/>
+        </w:tc>
+        <w:tc>
+          <w:tcPr>
+            <w:tcW w:w="2900" w:type="pct"/>
+            <w:tcBorders>
+              <w:top w:val="none" w:sz="0" w:space="0" w:color="FFFFFF"/>
+              <w:left w:val="none" w:sz="0" w:space="0" w:color="FFFFFF"/>
+              <w:bottom w:val="none" w:sz="0" w:space="0" w:color="FFFFFF"/>
+              <w:right w:val="none" w:sz="0" w:space="0" w:color="FFFFFF"/>
+            </w:tcBorders>
+          </w:tcPr>
+          <w:p/>
         </w:tc>
       </w:tr>
     </w:tbl>
@@ -1275,12 +1288,6 @@
         <w:gridCol w:w="7752"/>
       </w:tblGrid>
       <w:tr>
-        <w:tblPrEx>
-          <w:tblCellMar>
-            <w:top w:w="0" w:type="dxa"/>
-            <w:bottom w:w="0" w:type="dxa"/>
-          </w:tblCellMar>
-        </w:tblPrEx>
         <w:trPr>
           <w:jc w:val="center"/>
         </w:trPr>
@@ -1392,12 +1399,6 @@
         <w:gridCol w:w="4853"/>
       </w:tblGrid>
       <w:tr>
-        <w:tblPrEx>
-          <w:tblCellMar>
-            <w:top w:w="0" w:type="dxa"/>
-            <w:bottom w:w="0" w:type="dxa"/>
-          </w:tblCellMar>
-        </w:tblPrEx>
         <w:tc>
           <w:tcPr>
             <w:tcW w:w="2500" w:type="pct"/>

</xml_diff>